<commit_message>
Remove generated line count and add migration foundation
</commit_message>
<xml_diff>
--- a/docs/EduMindAgent_结课设计文档.docx
+++ b/docs/EduMindAgent_结课设计文档.docx
@@ -240,7 +240,7 @@
                 <w:b w:val="0"/>
                 <w:sz w:val="20"/>
               </w:rPr>
-              <w:t>前后端、测试、AI 资源目录等源码共 54566 行，满足团队项目 50000+ 行要求（scripts/linecount.mjs 统计）</w:t>
+              <w:t>第一阶段有效代码、SQL 迁移、测试和工程脚本共 3369 行；已排除 generated 文件，后续通过真实模块扩展至 50000+ 行</w:t>
             </w:r>
           </w:p>
         </w:tc>
@@ -4013,7 +4013,7 @@
                 <w:b w:val="0"/>
                 <w:sz w:val="20"/>
               </w:rPr>
-              <w:t>scripts/linecount.mjs 统计源码 54566 行，超过团队项目 50000 行要求；Server、Client、测试、脚本和 AI 资源目录均计入。</w:t>
+              <w:t>scripts/linecount.mjs 当前统计 3369 行，口径排除 generated 文件、日志、截图和压缩包；团队后续通过真实业务模块、SQL 迁移、知识库导入和测试补足 50000+ 行。</w:t>
             </w:r>
           </w:p>
         </w:tc>
@@ -5054,7 +5054,7 @@
                 <w:b w:val="0"/>
                 <w:sz w:val="20"/>
               </w:rPr>
-              <w:t>按团队项目要求扩展源码规模并接入 LM Studio Provider 接口</w:t>
+              <w:t>接入 LM Studio Provider 接口并完成早期资源目录验证</w:t>
             </w:r>
           </w:p>
         </w:tc>
@@ -5075,7 +5075,7 @@
                 <w:b w:val="0"/>
                 <w:sz w:val="20"/>
               </w:rPr>
-              <w:t>LMStudioProvider、2600 条本地课程资源、50000+ 行源码统计</w:t>
+              <w:t>LMStudioProvider、AI 本地课程资源原型</w:t>
             </w:r>
           </w:p>
         </w:tc>
@@ -5222,7 +5222,7 @@
           <w:rFonts w:ascii="Calibri" w:hAnsi="Calibri" w:eastAsia="Microsoft YaHei"/>
           <w:b w:val="0"/>
         </w:rPr>
-        <w:t>Commit 记录建议：正式提交到 Git 仓库时，可按“初始化项目”“实现后端服务”“实现前端工作台”“接入 LM Studio Provider”“配置 qwen3.5-9b 本地模型”“扩展团队项目代码规模”“补充测试与文档”组织提交历史。</w:t>
+        <w:t>Commit 记录建议：正式提交到 Git 仓库时，可按“初始化项目”“实现后端服务”“实现前端工作台”“接入 LM Studio Provider”“配置 qwen3.5-9b 本地模型”“移除 generated 计数风险”“扩展真实业务模块”“补充测试与文档”组织提交历史。</w:t>
       </w:r>
     </w:p>
     <w:p>

</xml_diff>

<commit_message>
Base follow-up work on teammate update
</commit_message>
<xml_diff>
--- a/docs/EduMindAgent_结课设计文档.docx
+++ b/docs/EduMindAgent_结课设计文档.docx
@@ -240,7 +240,7 @@
                 <w:b w:val="0"/>
                 <w:sz w:val="20"/>
               </w:rPr>
-              <w:t>第一阶段有效代码、SQL 迁移、测试和工程脚本共 3369 行；已排除 generated 文件，后续通过真实模块扩展至 50000+ 行</w:t>
+              <w:t>第一阶段可审查源码共 16885 行；统计已排除 generated 文件、日志、截图和运行数据，后续通过真实模块扩展到课程要求规模</w:t>
             </w:r>
           </w:p>
         </w:tc>
@@ -3084,7 +3084,7 @@
                 <w:b w:val="0"/>
                 <w:sz w:val="20"/>
               </w:rPr>
-              <w:t>Provider 接口</w:t>
+              <w:t>LM Studio Provider</w:t>
             </w:r>
           </w:p>
         </w:tc>
@@ -3881,7 +3881,7 @@
                 <w:b w:val="0"/>
                 <w:sz w:val="20"/>
               </w:rPr>
-              <w:t>Windows；Node.js 20+；浏览器 Chrome/Edge；LM Studio 本地模型服务 qwen3.5-9b-glm5.1-distill-v1；默认 AI 请求超时 90 秒。</w:t>
+              <w:t>Windows；Node.js 20+；浏览器 Chrome/Edge；LM Studio 本地模型服务 qwen3.5-9b-glm5.1-distill-v1。</w:t>
             </w:r>
           </w:p>
         </w:tc>
@@ -4013,7 +4013,7 @@
                 <w:b w:val="0"/>
                 <w:sz w:val="20"/>
               </w:rPr>
-              <w:t>scripts/linecount.mjs 当前统计 3369 行，口径排除 generated 文件、日志、截图和压缩包；团队后续通过真实业务模块、SQL 迁移、知识库导入和测试补足 50000+ 行。</w:t>
+              <w:t>scripts/linecount.mjs 当前统计可审查源码 16885 行；统计口径排除 generated 文件、日志、截图、文档和运行数据。</w:t>
             </w:r>
           </w:p>
         </w:tc>
@@ -4989,7 +4989,7 @@
                 <w:b w:val="0"/>
                 <w:sz w:val="20"/>
               </w:rPr>
-              <w:t>补充测试与 AI 课程资源目录</w:t>
+              <w:t>补充测试与 AI 课程知识库</w:t>
             </w:r>
           </w:p>
         </w:tc>
@@ -5010,7 +5010,7 @@
                 <w:b w:val="0"/>
                 <w:sz w:val="20"/>
               </w:rPr>
-              <w:t>3 个 Node.js 测试、AI 本地知识库初版</w:t>
+              <w:t>Node.js 测试、AI 本地知识库初版</w:t>
             </w:r>
           </w:p>
         </w:tc>
@@ -5054,7 +5054,7 @@
                 <w:b w:val="0"/>
                 <w:sz w:val="20"/>
               </w:rPr>
-              <w:t>接入 LM Studio Provider 接口并完成早期资源目录验证</w:t>
+              <w:t>接入 LM Studio Provider 接口并清理代码统计口径</w:t>
             </w:r>
           </w:p>
         </w:tc>
@@ -5075,7 +5075,72 @@
                 <w:b w:val="0"/>
                 <w:sz w:val="20"/>
               </w:rPr>
-              <w:t>LMStudioProvider、AI 本地课程资源原型</w:t>
+              <w:t>LMStudioProvider、手写课程知识库、有效代码统计脚本</w:t>
+            </w:r>
+          </w:p>
+        </w:tc>
+      </w:tr>
+      <w:tr>
+        <w:tc>
+          <w:tcPr>
+            <w:tcW w:type="dxa" w:w="1600"/>
+            <w:vAlign w:val="center"/>
+          </w:tcPr>
+          <w:p>
+            <w:pPr>
+              <w:spacing w:after="0" w:line="264" w:lineRule="auto"/>
+              <w:jc w:val="left"/>
+            </w:pPr>
+            <w:r/>
+            <w:r>
+              <w:rPr>
+                <w:rFonts w:ascii="Calibri" w:hAnsi="Calibri" w:eastAsia="Microsoft YaHei"/>
+                <w:b w:val="0"/>
+                <w:sz w:val="20"/>
+              </w:rPr>
+              <w:t>2026-05-23 17:40</w:t>
+            </w:r>
+          </w:p>
+        </w:tc>
+        <w:tc>
+          <w:tcPr>
+            <w:tcW w:type="dxa" w:w="3000"/>
+            <w:vAlign w:val="center"/>
+          </w:tcPr>
+          <w:p>
+            <w:pPr>
+              <w:spacing w:after="0" w:line="264" w:lineRule="auto"/>
+              <w:jc w:val="left"/>
+            </w:pPr>
+            <w:r/>
+            <w:r>
+              <w:rPr>
+                <w:rFonts w:ascii="Calibri" w:hAnsi="Calibri" w:eastAsia="Microsoft YaHei"/>
+                <w:b w:val="0"/>
+                <w:sz w:val="20"/>
+              </w:rPr>
+              <w:t>配置团队本地大模型服务</w:t>
+            </w:r>
+          </w:p>
+        </w:tc>
+        <w:tc>
+          <w:tcPr>
+            <w:tcW w:type="dxa" w:w="4760"/>
+            <w:vAlign w:val="center"/>
+          </w:tcPr>
+          <w:p>
+            <w:pPr>
+              <w:spacing w:after="0" w:line="264" w:lineRule="auto"/>
+              <w:jc w:val="left"/>
+            </w:pPr>
+            <w:r/>
+            <w:r>
+              <w:rPr>
+                <w:rFonts w:ascii="Calibri" w:hAnsi="Calibri" w:eastAsia="Microsoft YaHei"/>
+                <w:b w:val="0"/>
+                <w:sz w:val="20"/>
+              </w:rPr>
+              <w:t>默认接入 qwen3.5-9b-glm5.1-distill-v1，新增 npm run test:lmstudio 验证脚本</w:t>
             </w:r>
           </w:p>
         </w:tc>
@@ -5222,7 +5287,7 @@
           <w:rFonts w:ascii="Calibri" w:hAnsi="Calibri" w:eastAsia="Microsoft YaHei"/>
           <w:b w:val="0"/>
         </w:rPr>
-        <w:t>Commit 记录建议：正式提交到 Git 仓库时，可按“初始化项目”“实现后端服务”“实现前端工作台”“接入 LM Studio Provider”“配置 qwen3.5-9b 本地模型”“移除 generated 计数风险”“扩展真实业务模块”“补充测试与文档”组织提交历史。</w:t>
+        <w:t>Commit 记录建议：正式提交到 Git 仓库时，可按“初始化项目”“实现后端服务”“实现前端工作台”“接入 LM Studio Provider”“配置 qwen3.5-9b 本地模型”“扩展真实业务模块”“补充测试与文档”组织提交历史。</w:t>
       </w:r>
     </w:p>
     <w:p>

</xml_diff>

<commit_message>
Add knowledge service and update LM Studio defaults
</commit_message>
<xml_diff>
--- a/docs/EduMindAgent_结课设计文档.docx
+++ b/docs/EduMindAgent_结课设计文档.docx
@@ -240,7 +240,7 @@
                 <w:b w:val="0"/>
                 <w:sz w:val="20"/>
               </w:rPr>
-              <w:t>第一阶段可审查源码共 16885 行；统计已排除 generated 文件、日志、截图和运行数据，后续通过真实模块扩展到课程要求规模</w:t>
+              <w:t>第一阶段可审查源码共 18604 行；统计已排除 generated 文件、日志、截图和运行数据，后续通过真实模块扩展到课程要求规模</w:t>
             </w:r>
           </w:p>
         </w:tc>
@@ -3105,7 +3105,7 @@
                 <w:b w:val="0"/>
                 <w:sz w:val="20"/>
               </w:rPr>
-              <w:t>默认接入 qwen3.5-9b-glm5.1-distill-v1；Mock 仅用于离线回退和单元测试</w:t>
+              <w:t>默认接入 qwopus3.6-27b-v2-mtp@iq4_xs；Mock 仅用于离线回退和单元测试</w:t>
             </w:r>
           </w:p>
         </w:tc>
@@ -3610,7 +3610,7 @@
                 <w:b w:val="0"/>
                 <w:sz w:val="20"/>
               </w:rPr>
-              <w:t>Node.js 单进程部署静态前端和 API；LM Studio 在 172.25.160.1:1234 启动 OpenAI-compatible Server；自动部署可用 GitHub Actions 或服务器脚本。</w:t>
+              <w:t>Node.js 单进程部署静态前端和 API；LM Studio 在 10.108.10.110:1234 启动 OpenAI-compatible Server；自动部署可用 GitHub Actions 或服务器脚本。</w:t>
             </w:r>
           </w:p>
         </w:tc>
@@ -3695,7 +3695,7 @@
           <w:rFonts w:ascii="Calibri" w:hAnsi="Calibri" w:eastAsia="Microsoft YaHei"/>
           <w:b w:val="0"/>
         </w:rPr>
-        <w:t>AITutorService 不直接绑定某个云厂商，而是依赖 Provider 的 complete(messages) 能力。团队部署默认使用 LMStudioProvider 指向 http://172.25.160.1:1234/v1/chat/completions，并调用 qwen3.5-9b-glm5.1-distill-v1；MockLLMProvider 仅用于离线回退和单元测试。项目提供 npm run test:lmstudio 脚本用于提交前真实请求本地模型。</w:t>
+        <w:t>AITutorService 不直接绑定某个云厂商，而是依赖 Provider 的 complete(messages) 能力。团队部署默认使用 LMStudioProvider 指向 http://10.108.10.110:1234/v1/chat/completions，并调用 qwopus3.6-27b-v2-mtp@iq4_xs；MockLLMProvider 仅用于离线回退和单元测试。项目提供 npm run test:lmstudio 脚本用于提交前真实请求本地模型。</w:t>
       </w:r>
     </w:p>
     <w:p>
@@ -3881,7 +3881,7 @@
                 <w:b w:val="0"/>
                 <w:sz w:val="20"/>
               </w:rPr>
-              <w:t>Windows；Node.js 20+；浏览器 Chrome/Edge；LM Studio 本地模型服务 qwen3.5-9b-glm5.1-distill-v1。</w:t>
+              <w:t>Windows；Node.js 20+；浏览器 Chrome/Edge；LM Studio 本地模型服务 qwopus3.6-27b-v2-mtp@iq4_xs。</w:t>
             </w:r>
           </w:p>
         </w:tc>
@@ -4013,7 +4013,7 @@
                 <w:b w:val="0"/>
                 <w:sz w:val="20"/>
               </w:rPr>
-              <w:t>scripts/linecount.mjs 当前统计可审查源码 16885 行；统计口径排除 generated 文件、日志、截图、文档和运行数据。</w:t>
+              <w:t>scripts/linecount.mjs 当前统计可审查源码 18604 行；统计口径排除 generated 文件、日志、截图、文档和运行数据。</w:t>
             </w:r>
           </w:p>
         </w:tc>
@@ -4568,7 +4568,7 @@
           <w:rFonts w:ascii="Calibri" w:hAnsi="Calibri" w:eastAsia="Microsoft YaHei"/>
           <w:sz w:val="22"/>
         </w:rPr>
-        <w:t>AI 服务设计：系统自身内置 AITutorService、PromptTemplate、MockLLMProvider、LMStudioProvider 和 OpenAICompatibleProvider。团队部署时由 LM Studio 提供 qwen3.5-9b-glm5.1-distill-v1 模型服务，地址为 http://172.25.160.1:1234；提交前通过 npm run test:lmstudio 验证真实模型调用。</w:t>
+        <w:t>AI 服务设计：系统自身内置 AITutorService、PromptTemplate、MockLLMProvider、LMStudioProvider 和 OpenAICompatibleProvider。团队部署时由 LM Studio 提供 qwopus3.6-27b-v2-mtp@iq4_xs 模型服务，地址为 http://10.108.10.110:1234；提交前通过 npm run test:lmstudio 验证真实模型调用。</w:t>
       </w:r>
     </w:p>
     <w:p>
@@ -5140,7 +5140,7 @@
                 <w:b w:val="0"/>
                 <w:sz w:val="20"/>
               </w:rPr>
-              <w:t>默认接入 qwen3.5-9b-glm5.1-distill-v1，新增 npm run test:lmstudio 验证脚本</w:t>
+              <w:t>默认接入 qwopus3.6-27b-v2-mtp@iq4_xs，新增 npm run test:lmstudio 验证脚本</w:t>
             </w:r>
           </w:p>
         </w:tc>
@@ -5287,7 +5287,7 @@
           <w:rFonts w:ascii="Calibri" w:hAnsi="Calibri" w:eastAsia="Microsoft YaHei"/>
           <w:b w:val="0"/>
         </w:rPr>
-        <w:t>Commit 记录建议：正式提交到 Git 仓库时，可按“初始化项目”“实现后端服务”“实现前端工作台”“接入 LM Studio Provider”“配置 qwen3.5-9b 本地模型”“扩展真实业务模块”“补充测试与文档”组织提交历史。</w:t>
+        <w:t>Commit 记录建议：正式提交到 Git 仓库时，可按“初始化项目”“实现后端服务”“实现前端工作台”“接入 LM Studio Provider”“配置 qwopus3.6 本地模型”“扩展真实业务模块”“补充测试与文档”组织提交历史。</w:t>
       </w:r>
     </w:p>
     <w:p>

</xml_diff>